<commit_message>
feat: data de término e cláusula de desistência no contrato
- Novo placeholder {data_termino} calculado como data_inicio + 12 meses
  (usa Date.UTC pra evitar shift de timezone; JS normaliza 29/02 + 12m).
- Linha 'DATA DE TÉRMINO' logo após 'DATA DE INÍCIO' nos dados do
  participante.
- Dois parágrafos de "12 meses a partir de X" agora exibem "(até
  {data_termino})" entre parênteses, deixando o prazo explícito.
- Nova cláusula 'CLÁUSULA DE DESISTÊNCIA' entre OBRIGAÇÕES FINANCEIRAS
  e GARANTIA CONDICIONAL — multa de 20% sobre valor restante (à vista:
  total − pago; a prazo: parcelas não vencidas). 10 dias pra quitar.
- test-render.mjs e test-pdf.mjs atualizados com o novo campo.

Deploy: template-modelo.docx 13817 bytes no Storage + create-contract
edge function v14.

Co-Authored-By: Claude Opus 4.7 (1M context) <noreply@anthropic.com>
</commit_message>
<xml_diff>
--- a/tools/contrato-modelo.docx
+++ b/tools/contrato-modelo.docx
@@ -129,6 +129,21 @@
           <w:b/>
           <w:bCs/>
         </w:rPr>
+        <w:t xml:space="preserve">DATA DE TÉRMINO: </w:t>
+      </w:r>
+      <w:r>
+        <w:t xml:space="preserve">{data_termino}</w:t>
+      </w:r>
+    </w:p>
+    <w:p>
+      <w:pPr>
+        <w:spacing w:after="120"/>
+      </w:pPr>
+      <w:r>
+        <w:rPr>
+          <w:b/>
+          <w:bCs/>
+        </w:rPr>
         <w:t xml:space="preserve">E-MAIL: </w:t>
       </w:r>
       <w:r>
@@ -331,7 +346,17 @@
         <w:t xml:space="preserve">{data_inicio}</w:t>
       </w:r>
       <w:r>
-        <w:t xml:space="preserve">.</w:t>
+        <w:t xml:space="preserve"> (até </w:t>
+      </w:r>
+      <w:r>
+        <w:rPr>
+          <w:b/>
+          <w:bCs/>
+        </w:rPr>
+        <w:t xml:space="preserve">{data_termino}</w:t>
+      </w:r>
+      <w:r>
+        <w:t xml:space="preserve">).</w:t>
       </w:r>
     </w:p>
     <w:p>
@@ -365,7 +390,17 @@
         <w:t xml:space="preserve">{data_inicio}</w:t>
       </w:r>
       <w:r>
-        <w:t xml:space="preserve">, mantendo os entregáveis e materiais durante esse período e enquanto o plano contratado estiver ativo.</w:t>
+        <w:t xml:space="preserve"> (até </w:t>
+      </w:r>
+      <w:r>
+        <w:rPr>
+          <w:b/>
+          <w:bCs/>
+        </w:rPr>
+        <w:t xml:space="preserve">{data_termino}</w:t>
+      </w:r>
+      <w:r>
+        <w:t xml:space="preserve">), mantendo os entregáveis e materiais durante esse período e enquanto o plano contratado estiver ativo.</w:t>
       </w:r>
     </w:p>
     <w:p>
@@ -772,6 +807,67 @@
       </w:pPr>
       <w:r>
         <w:t xml:space="preserve">Não há garantia incondicional de ganhos financeiros: os resultados dependem exclusivamente da dedicação, do esforço e da aplicação correta do método por parte de cada participante. Caso esteja insatisfeito, o participante deverá comunicar a equipe para a devida avaliação, caso a caso.</w:t>
+      </w:r>
+    </w:p>
+    <w:p>
+      <w:pPr>
+        <w:spacing w:after="120"/>
+      </w:pPr>
+      <w:r>
+        <w:t xml:space="preserve"/>
+      </w:r>
+    </w:p>
+    <w:p>
+      <w:pPr>
+        <w:pStyle w:val="Heading2"/>
+        <w:spacing w:after="120" w:before="240"/>
+      </w:pPr>
+      <w:r>
+        <w:rPr>
+          <w:b/>
+          <w:bCs/>
+        </w:rPr>
+        <w:t xml:space="preserve">CLÁUSULA DE DESISTÊNCIA</w:t>
+      </w:r>
+    </w:p>
+    <w:p>
+      <w:pPr>
+        <w:spacing w:after="120"/>
+      </w:pPr>
+      <w:r>
+        <w:t xml:space="preserve">Em caso de desistência por parte do participante após a assinatura deste contrato, será devida multa compensatória de 20% (vinte por cento) sobre o valor restante do contrato, entendido como:</w:t>
+      </w:r>
+    </w:p>
+    <w:p>
+      <w:pPr>
+        <w:spacing w:after="120"/>
+      </w:pPr>
+      <w:r>
+        <w:t xml:space="preserve">a) na modalidade à vista, o valor total do contrato subtraído do que foi efetivamente pago até a data da comunicação da desistência;</w:t>
+      </w:r>
+    </w:p>
+    <w:p>
+      <w:pPr>
+        <w:spacing w:after="120"/>
+      </w:pPr>
+      <w:r>
+        <w:t xml:space="preserve">b) na modalidade a prazo, o somatório das parcelas ainda não vencidas na data da comunicação da desistência.</w:t>
+      </w:r>
+    </w:p>
+    <w:p>
+      <w:pPr>
+        <w:spacing w:after="120"/>
+      </w:pPr>
+      <w:r>
+        <w:t xml:space="preserve">A desistência deverá ser comunicada por escrito à CONTRATADA, preferencialmente pelos canais oficiais informados no programa. O prazo para quitação da multa é de 10 (dez) dias corridos a contar da data da comunicação formal.</w:t>
+      </w:r>
+    </w:p>
+    <w:p>
+      <w:pPr>
+        <w:spacing w:after="120"/>
+      </w:pPr>
+      <w:r>
+        <w:t xml:space="preserve">A multa prevista nesta cláusula não se confunde com parcelas já vencidas e não pagas, que permanecem plenamente exigíveis.</w:t>
       </w:r>
     </w:p>
     <w:p>

</xml_diff>

<commit_message>
feat: meio de pagamento por enum em ambas modalidades, UX desambiguada
- "À Vista" / "A Prazo" → "Pagamento integral" / "Entrada + parcelado"
  (estavam sugerindo cartão vs boleto; comerciais ficavam em dúvida ao
  preencher casos reais como "R$ 30k integral no cartão" ou "entrada
  + parcelado tudo no cartão").
- Select fixo (Cartão de crédito / PIX / Boleto) substitui input livre
  no integral e adiciona o mesmo no parcelado (antes não tinha).
- Tabela de parcelas: "Data de vencimento" → "Data de cobrança"
  (genérico, não sugere boleto).
- Bloco parcelado do contrato agora explicita "via {meio}".
- Helper text em "Valor da reserva / sinal" explicando que é o valor
  pago como garantia de vaga (geralmente igual à entrada, mas pode
  ser diferente).
- ContractDetail com fallback ?? 'Cartão de crédito' pra contratos
  antigos sem meio_pagamento no parcelado.

Template DOCX 13832 bytes, edge function v15 deployada.

Co-Authored-By: Claude Opus 4.7 (1M context) <noreply@anthropic.com>
</commit_message>
<xml_diff>
--- a/tools/contrato-modelo.docx
+++ b/tools/contrato-modelo.docx
@@ -1069,7 +1069,17 @@
         <w:spacing w:after="120"/>
       </w:pPr>
       <w:r>
-        <w:t xml:space="preserve">Entrada de </w:t>
+        <w:t xml:space="preserve">Pagamento parcelado via </w:t>
+      </w:r>
+      <w:r>
+        <w:rPr>
+          <w:b/>
+          <w:bCs/>
+        </w:rPr>
+        <w:t xml:space="preserve">{prazo_meio}</w:t>
+      </w:r>
+      <w:r>
+        <w:t xml:space="preserve">: entrada de </w:t>
       </w:r>
       <w:r>
         <w:rPr>
@@ -1176,7 +1186,7 @@
                 <w:b/>
                 <w:bCs/>
               </w:rPr>
-              <w:t xml:space="preserve">Data de vencimento</w:t>
+              <w:t xml:space="preserve">Data de cobrança</w:t>
             </w:r>
           </w:p>
         </w:tc>

</xml_diff>

<commit_message>
feat: campo 'parcelas no cartão' no pagamento integral
Quando integral + meio = Cartão de crédito, novo campo 'Em quantas
vezes no cartão?' (1-24, default 1). A Cris recebe integral, mas o
contrato registra como o cliente parcelou.

No contrato:
- 1x ou outros meios: 'Pagamento integral de X em data, via Cartão de
  crédito.'
- 2x+: '...via Cartão de crédito em 12x.'

Implementação:
- Tipo PagamentoVista ganhou parcelas_cartao?: number
- Schema zod com .min(1).max(24).optional()
- Form: input numérico condicional (visible só se VISTA + Cartão)
- ContractDetail: exibe ' em Nx' no pagamento
- Template: novo placeholder {vista_parcelas_label} no bloco À Vista

Template DOCX 13832 bytes, edge function v16 deployada.

Co-Authored-By: Claude Opus 4.7 (1M context) <noreply@anthropic.com>
</commit_message>
<xml_diff>
--- a/tools/contrato-modelo.docx
+++ b/tools/contrato-modelo.docx
@@ -1019,7 +1019,7 @@
         <w:spacing w:after="120"/>
       </w:pPr>
       <w:r>
-        <w:t xml:space="preserve">Pagamento à vista de </w:t>
+        <w:t xml:space="preserve">Pagamento integral de </w:t>
       </w:r>
       <w:r>
         <w:rPr>
@@ -1043,6 +1043,9 @@
       </w:r>
       <w:r>
         <w:t xml:space="preserve">{vista_meio}</w:t>
+      </w:r>
+      <w:r>
+        <w:t xml:space="preserve">{vista_parcelas_label}</w:t>
       </w:r>
       <w:r>
         <w:t xml:space="preserve">.</w:t>

</xml_diff>

<commit_message>
rename: Mentoria DEX → Mentoria DSD em todo o sistema
- Frontend: title, Login, Dashboard, business-rules
- Edge functions: create-contract (doc name), autentique-webhook
  (filename Drive: 'Contrato DSD - ...'), template-data (comment)
- Template DOCX: título 'MENTORIA DSD', 'A Mentoria DSD é...',
  'Comunidade DSD' (era DEx), 'App DSD' (era DEx), imagem/áudio da
  'Mentoria DSD'
- SETUP.md
- Arquivo modelo renomeado: 'Contrato Mentoria DSD - Modelo.docx'

Fix bônus: removida duplicata do campo vista_parcelas_label em
template-data.ts (aparecia 2x no return, o segundo sobrescrevia).

Deploy: template DOCX no Storage (13841 bytes), create-contract v18,
autentique-webhook v19.

Nota: subdomínio da URL (assinatura-dex) e nome do repo GitHub
mantidos por enquanto — renomear rewrites URL/remote e não é urgente.
Se quiser trocar depois, uso gh repo rename + ajusto DNS e vite.config.

Co-Authored-By: Claude Opus 4.7 (1M context) <noreply@anthropic.com>
</commit_message>
<xml_diff>
--- a/tools/contrato-modelo.docx
+++ b/tools/contrato-modelo.docx
@@ -14,7 +14,7 @@
           <w:sz w:val="28"/>
           <w:szCs w:val="28"/>
         </w:rPr>
-        <w:t xml:space="preserve">REGRAS E TERMO DE PARTICIPAÇÃO — MENTORIA DEX</w:t>
+        <w:t xml:space="preserve">REGRAS E TERMO DE PARTICIPAÇÃO — MENTORIA DSD</w:t>
       </w:r>
     </w:p>
     <w:p>
@@ -310,7 +310,7 @@
         <w:spacing w:after="120"/>
       </w:pPr>
       <w:r>
-        <w:t xml:space="preserve">A Mentoria DEX é um programa em grupo que acompanha e auxilia os membros na construção, venda e entrega de uma odontologia do cuidado, cujo ticket médio pode chegar a R$ 20.000,00 por tratamento periodontal não cirúrgico.</w:t>
+        <w:t xml:space="preserve">A Mentoria DSD é um programa em grupo que acompanha e auxilia os membros na construção, venda e entrega de uma odontologia do cuidado, cujo ticket médio pode chegar a R$ 20.000,00 por tratamento periodontal não cirúrgico.</w:t>
       </w:r>
     </w:p>
     <w:p>
@@ -473,7 +473,7 @@
           <w:b/>
           <w:bCs/>
         </w:rPr>
-        <w:t xml:space="preserve">III) Comunidade DEx — exclusiva para os membros da mentoria</w:t>
+        <w:t xml:space="preserve">III) Comunidade DSD — exclusiva para os membros da mentoria</w:t>
       </w:r>
     </w:p>
     <w:p>
@@ -589,7 +589,7 @@
           <w:b/>
           <w:bCs/>
         </w:rPr>
-        <w:t xml:space="preserve">X) App DEx</w:t>
+        <w:t xml:space="preserve">X) App DSD</w:t>
       </w:r>
     </w:p>
     <w:p>
@@ -774,7 +774,7 @@
         <w:spacing w:after="120"/>
       </w:pPr>
       <w:r>
-        <w:t xml:space="preserve">Pelo presente instrumento, o(a) participante e/ou seu representante legal autoriza(m), a título gratuito, o uso de sua imagem em fotos, filmagens e áudios coletados no programa, para peças publicitárias e institucionais da CONTRATADA e da Mentoria DEX.</w:t>
+        <w:t xml:space="preserve">Pelo presente instrumento, o(a) participante e/ou seu representante legal autoriza(m), a título gratuito, o uso de sua imagem em fotos, filmagens e áudios coletados no programa, para peças publicitárias e institucionais da CONTRATADA e da Mentoria DSD.</w:t>
       </w:r>
     </w:p>
     <w:p>

</xml_diff>